<commit_message>
fix(table): word export .docx template title field fix
</commit_message>
<xml_diff>
--- a/unique_toolkit/unique_toolkit/_common/docx_generator/template/Doc Template.docx
+++ b/unique_toolkit/unique_toolkit/_common/docx_generator/template/Doc Template.docx
@@ -17,6 +17,12 @@
         <w:t>{{</w:t>
       </w:r>
       <w:proofErr w:type="spellStart"/>
+      <w:r>
+        <w:rPr>
+          <w:lang w:val="fr-CH"/>
+        </w:rPr>
+        <w:t>document_</w:t>
+      </w:r>
       <w:r>
         <w:rPr>
           <w:lang w:val="fr-CH"/>

</xml_diff>